<commit_message>
Integration des decharges et ajout du prix d'achat pour calculer les marges sur les factures
</commit_message>
<xml_diff>
--- a/app/core/documents/demo_ms_word.docx
+++ b/app/core/documents/demo_ms_word.docx
@@ -4,82 +4,320 @@
   <w:body>
     <w:p>
       <w:pPr>
-        <w:pStyle w:val="Titre"/>
-        <w:rPr>
-          <w:lang w:val="en-US"/>
-        </w:rPr>
-      </w:pPr>
-      <w:proofErr w:type="spellStart"/>
-      <w:r>
-        <w:rPr>
-          <w:lang w:val="en-US"/>
-        </w:rPr>
-        <w:t>OpenTBS</w:t>
-      </w:r>
-      <w:proofErr w:type="spellEnd"/>
-      <w:r>
-        <w:rPr>
-          <w:lang w:val="en-US"/>
-        </w:rPr>
-        <w:t xml:space="preserve"> demo</w:t>
-      </w:r>
-    </w:p>
-    <w:p>
-      <w:pPr>
-        <w:rPr>
-          <w:noProof/>
-          <w:lang w:val="en-US"/>
-        </w:rPr>
-      </w:pPr>
-      <w:r>
-        <w:rPr>
-          <w:lang w:val="en-US"/>
-        </w:rPr>
-        <w:t xml:space="preserve">Hello </w:t>
-      </w:r>
-      <w:r>
-        <w:rPr>
-          <w:b/>
-          <w:noProof/>
-          <w:lang w:val="en-US"/>
-        </w:rPr>
-        <w:t>[</w:t>
-      </w:r>
-      <w:r>
-        <w:rPr>
-          <w:b/>
-          <w:noProof/>
-          <w:lang w:val="en-US"/>
-        </w:rPr>
-        <w:t>description</w:t>
-      </w:r>
-      <w:r>
-        <w:rPr>
-          <w:b/>
-          <w:noProof/>
-          <w:lang w:val="en-US"/>
-        </w:rPr>
-        <w:t>]</w:t>
-      </w:r>
-      <w:r>
-        <w:rPr>
-          <w:noProof/>
-          <w:lang w:val="en-US"/>
-        </w:rPr>
-        <w:t>,</w:t>
-      </w:r>
-    </w:p>
-    <w:p>
-      <w:pPr>
+        <w:spacing w:after="0" w:line="240" w:lineRule="auto"/>
         <w:ind w:left="284"/>
         <w:rPr>
-          <w:lang w:val="en-US"/>
+          <w:u w:val="single"/>
         </w:rPr>
       </w:pPr>
+      <w:r>
+        <w:t xml:space="preserve">                          </w:t>
+      </w:r>
+      <w:r>
+        <w:rPr>
+          <w:u w:val="single"/>
+        </w:rPr>
+        <w:t>FICHE DE VERSEMENT</w:t>
+      </w:r>
+    </w:p>
+    <w:p>
+      <w:pPr>
+        <w:spacing w:after="0" w:line="240" w:lineRule="auto"/>
+        <w:ind w:left="284"/>
+      </w:pPr>
+    </w:p>
+    <w:p>
+      <w:pPr>
+        <w:spacing w:after="0" w:line="360" w:lineRule="auto"/>
+        <w:ind w:left="284"/>
+      </w:pPr>
+      <w:r>
+        <w:t>Numéro de la fiche</w:t>
+      </w:r>
+      <w:r>
+        <w:tab/>
+      </w:r>
+      <w:r>
+        <w:t>:</w:t>
+      </w:r>
+      <w:r>
+        <w:tab/>
+      </w:r>
+      <w:r>
+        <w:t>[</w:t>
+      </w:r>
+      <w:proofErr w:type="spellStart"/>
+      <w:r>
+        <w:t>numero</w:t>
+      </w:r>
+      <w:proofErr w:type="spellEnd"/>
+      <w:r>
+        <w:t>]</w:t>
+      </w:r>
+    </w:p>
+    <w:p>
+      <w:pPr>
+        <w:spacing w:after="0" w:line="360" w:lineRule="auto"/>
+        <w:ind w:left="284"/>
+      </w:pPr>
+      <w:r>
+        <w:t>Date de versement</w:t>
+      </w:r>
+      <w:r>
+        <w:tab/>
+      </w:r>
+      <w:r>
+        <w:t>:</w:t>
+      </w:r>
+      <w:r>
+        <w:tab/>
+      </w:r>
+      <w:r>
+        <w:t>[date]</w:t>
+      </w:r>
+    </w:p>
+    <w:p>
+      <w:pPr>
+        <w:spacing w:after="0" w:line="240" w:lineRule="auto"/>
+        <w:ind w:left="284"/>
+      </w:pPr>
+      <w:r>
+        <w:t>Versé pour la date</w:t>
+      </w:r>
+      <w:r>
+        <w:tab/>
+        <w:t>:</w:t>
+      </w:r>
+      <w:r>
+        <w:tab/>
+        <w:t>[datePour]</w:t>
+      </w:r>
+    </w:p>
+    <w:p>
+      <w:pPr>
+        <w:spacing w:after="0" w:line="240" w:lineRule="auto"/>
+        <w:ind w:left="284"/>
+      </w:pPr>
+      <w:r>
+        <w:t>------------------------------------------------------------</w:t>
+      </w:r>
+      <w:r>
+        <w:t>------------------------------------------------</w:t>
+      </w:r>
+    </w:p>
+    <w:p>
+      <w:pPr>
+        <w:spacing w:after="0" w:line="360" w:lineRule="auto"/>
+        <w:ind w:left="284"/>
+      </w:pPr>
+      <w:r>
+        <w:t>Nom du déposant</w:t>
+      </w:r>
+      <w:r>
+        <w:tab/>
+      </w:r>
+      <w:r>
+        <w:tab/>
+      </w:r>
+      <w:r>
+        <w:t xml:space="preserve">: </w:t>
+      </w:r>
+      <w:r>
+        <w:tab/>
+      </w:r>
+      <w:r>
+        <w:t>[</w:t>
+      </w:r>
+      <w:proofErr w:type="spellStart"/>
+      <w:r>
+        <w:t>nom_deposant</w:t>
+      </w:r>
+      <w:proofErr w:type="spellEnd"/>
+      <w:r>
+        <w:t>]</w:t>
+      </w:r>
+    </w:p>
+    <w:p>
+      <w:pPr>
+        <w:spacing w:after="0" w:line="360" w:lineRule="auto"/>
+        <w:ind w:left="284"/>
+      </w:pPr>
+      <w:r>
+        <w:t>Montant versé</w:t>
+      </w:r>
+      <w:r>
+        <w:tab/>
+      </w:r>
+      <w:r>
+        <w:tab/>
+      </w:r>
+      <w:r>
+        <w:t xml:space="preserve">: </w:t>
+      </w:r>
+      <w:r>
+        <w:tab/>
+      </w:r>
+      <w:r>
+        <w:t>[montant] F CFA</w:t>
+      </w:r>
+    </w:p>
+    <w:p>
+      <w:pPr>
+        <w:spacing w:after="0" w:line="360" w:lineRule="auto"/>
+        <w:ind w:left="284"/>
+      </w:pPr>
+      <w:r>
+        <w:t>Mode de paiement</w:t>
+      </w:r>
+      <w:r>
+        <w:tab/>
+      </w:r>
+      <w:r>
+        <w:tab/>
+      </w:r>
+      <w:r>
+        <w:t xml:space="preserve">: </w:t>
+      </w:r>
+      <w:r>
+        <w:tab/>
+      </w:r>
+      <w:r>
+        <w:t>Espèces</w:t>
+      </w:r>
+    </w:p>
+    <w:p>
+      <w:pPr>
+        <w:spacing w:after="0" w:line="360" w:lineRule="auto"/>
+        <w:ind w:left="284"/>
+      </w:pPr>
+      <w:r>
+        <w:t>Banque (si applicable</w:t>
+      </w:r>
+      <w:r>
+        <w:t>)</w:t>
+      </w:r>
+      <w:r>
+        <w:tab/>
+      </w:r>
+      <w:r>
+        <w:t xml:space="preserve">: </w:t>
+      </w:r>
+      <w:r>
+        <w:tab/>
+      </w:r>
+      <w:r>
+        <w:t>[banque]</w:t>
+      </w:r>
+    </w:p>
+    <w:p>
+      <w:pPr>
+        <w:spacing w:after="0" w:line="360" w:lineRule="auto"/>
+        <w:ind w:left="284"/>
+      </w:pPr>
+      <w:r>
+        <w:t>Motif du versement</w:t>
+      </w:r>
+      <w:r>
+        <w:tab/>
+      </w:r>
+      <w:r>
+        <w:tab/>
+      </w:r>
+      <w:r>
+        <w:t xml:space="preserve">: </w:t>
+      </w:r>
+      <w:r>
+        <w:tab/>
+      </w:r>
+      <w:r>
+        <w:t>[motif]</w:t>
+      </w:r>
+    </w:p>
+    <w:p>
+      <w:pPr>
+        <w:spacing w:after="0" w:line="240" w:lineRule="auto"/>
+        <w:ind w:left="284"/>
+      </w:pPr>
+    </w:p>
+    <w:p>
+      <w:pPr>
+        <w:spacing w:after="0" w:line="240" w:lineRule="auto"/>
+        <w:ind w:left="284"/>
+      </w:pPr>
+      <w:r>
+        <w:t>------------------------------------------------------------------------------------------------------------</w:t>
+      </w:r>
+    </w:p>
+    <w:p>
+      <w:pPr>
+        <w:spacing w:after="0" w:line="240" w:lineRule="auto"/>
+        <w:ind w:left="284"/>
+      </w:pPr>
+    </w:p>
+    <w:p>
+      <w:pPr>
+        <w:spacing w:after="0" w:line="240" w:lineRule="auto"/>
+        <w:ind w:left="284"/>
+      </w:pPr>
+      <w:r>
+        <w:t xml:space="preserve">                      Signature du déposant :</w:t>
+      </w:r>
+    </w:p>
+    <w:p>
+      <w:pPr>
+        <w:spacing w:after="0" w:line="240" w:lineRule="auto"/>
+        <w:ind w:left="284"/>
+      </w:pPr>
+    </w:p>
+    <w:p>
+      <w:pPr>
+        <w:spacing w:after="0" w:line="240" w:lineRule="auto"/>
+        <w:ind w:left="284"/>
+      </w:pPr>
+      <w:r>
+        <w:t xml:space="preserve">                      ___________________________</w:t>
+      </w:r>
+    </w:p>
+    <w:p>
+      <w:pPr>
+        <w:spacing w:after="0" w:line="240" w:lineRule="auto"/>
+        <w:ind w:left="284"/>
+      </w:pPr>
+    </w:p>
+    <w:p>
+      <w:pPr>
+        <w:spacing w:after="0" w:line="240" w:lineRule="auto"/>
+        <w:ind w:left="284"/>
+      </w:pPr>
+      <w:r>
+        <w:t xml:space="preserve">                      Signature du réceptionnaire :</w:t>
+      </w:r>
+    </w:p>
+    <w:p>
+      <w:pPr>
+        <w:spacing w:after="0" w:line="240" w:lineRule="auto"/>
+        <w:ind w:left="284"/>
+      </w:pPr>
+    </w:p>
+    <w:p>
+      <w:pPr>
+        <w:spacing w:after="0" w:line="240" w:lineRule="auto"/>
+        <w:ind w:left="284"/>
+      </w:pPr>
+      <w:r>
+        <w:t xml:space="preserve">                      ___________________________</w:t>
+      </w:r>
+    </w:p>
+    <w:p>
+      <w:pPr>
+        <w:spacing w:after="0" w:line="240" w:lineRule="auto"/>
+        <w:ind w:left="284"/>
+      </w:pPr>
     </w:p>
     <w:sectPr>
-      <w:pgSz w:w="11906" w:h="16838"/>
-      <w:pgMar w:top="1418" w:right="1418" w:bottom="1418" w:left="1418" w:header="709" w:footer="709" w:gutter="0"/>
+      <w:footerReference w:type="default" r:id="rId8"/>
+      <w:pgSz w:w="11900" w:h="8400" w:orient="landscape"/>
+      <w:pgMar w:top="720" w:right="720" w:bottom="720" w:left="720" w:header="709" w:footer="0" w:gutter="0"/>
       <w:cols w:space="708"/>
       <w:docGrid w:linePitch="360"/>
     </w:sectPr>
@@ -110,6 +348,107 @@
     </w:p>
   </w:endnote>
 </w:endnotes>
+</file>
+
+<file path=word/footer1.xml><?xml version="1.0" encoding="utf-8"?>
+<w:ftr xmlns:wpc="http://schemas.microsoft.com/office/word/2010/wordprocessingCanvas" xmlns:cx="http://schemas.microsoft.com/office/drawing/2014/chartex" xmlns:cx1="http://schemas.microsoft.com/office/drawing/2015/9/8/chartex" xmlns:cx2="http://schemas.microsoft.com/office/drawing/2015/10/21/chartex" xmlns:cx3="http://schemas.microsoft.com/office/drawing/2016/5/9/chartex" xmlns:cx4="http://schemas.microsoft.com/office/drawing/2016/5/10/chartex" xmlns:cx5="http://schemas.microsoft.com/office/drawing/2016/5/11/chartex" xmlns:cx6="http://schemas.microsoft.com/office/drawing/2016/5/12/chartex" xmlns:cx7="http://schemas.microsoft.com/office/drawing/2016/5/13/chartex" xmlns:cx8="http://schemas.microsoft.com/office/drawing/2016/5/14/chartex" xmlns:mc="http://schemas.openxmlformats.org/markup-compatibility/2006" xmlns:aink="http://schemas.microsoft.com/office/drawing/2016/ink" xmlns:am3d="http://schemas.microsoft.com/office/drawing/2017/model3d" xmlns:o="urn:schemas-microsoft-com:office:office" xmlns:oel="http://schemas.microsoft.com/office/2019/extlst" xmlns:r="http://schemas.openxmlformats.org/officeDocument/2006/relationships" xmlns:m="http://schemas.openxmlformats.org/officeDocument/2006/math" xmlns:v="urn:schemas-microsoft-com:vml" xmlns:wp14="http://schemas.microsoft.com/office/word/2010/wordprocessingDrawing" xmlns:wp="http://schemas.openxmlformats.org/drawingml/2006/wordprocessingDrawing" xmlns:w10="urn:schemas-microsoft-com:office:word" xmlns:w="http://schemas.openxmlformats.org/wordprocessingml/2006/main" xmlns:w14="http://schemas.microsoft.com/office/word/2010/wordml" xmlns:w15="http://schemas.microsoft.com/office/word/2012/wordml" xmlns:w16cex="http://schemas.microsoft.com/office/word/2018/wordml/cex" xmlns:w16cid="http://schemas.microsoft.com/office/word/2016/wordml/cid" xmlns:w16="http://schemas.microsoft.com/office/word/2018/wordml" xmlns:w16sdtdh="http://schemas.microsoft.com/office/word/2020/wordml/sdtdatahash" xmlns:w16se="http://schemas.microsoft.com/office/word/2015/wordml/symex" xmlns:wpg="http://schemas.microsoft.com/office/word/2010/wordprocessingGroup" xmlns:wpi="http://schemas.microsoft.com/office/word/2010/wordprocessingInk" xmlns:wne="http://schemas.microsoft.com/office/word/2006/wordml" xmlns:wps="http://schemas.microsoft.com/office/word/2010/wordprocessingShape" mc:Ignorable="w14 w15 w16se w16cid w16 w16cex w16sdtdh wp14">
+  <w:p>
+    <w:pPr>
+      <w:pStyle w:val="Pieddepage"/>
+    </w:pPr>
+    <w:r>
+      <w:rPr>
+        <w:noProof/>
+      </w:rPr>
+      <mc:AlternateContent>
+        <mc:Choice Requires="wps">
+          <w:drawing>
+            <wp:anchor distT="0" distB="0" distL="114300" distR="114300" simplePos="0" relativeHeight="251659264" behindDoc="0" locked="0" layoutInCell="1" allowOverlap="1" wp14:anchorId="08B47486" wp14:editId="0E0E9414">
+              <wp:simplePos x="0" y="0"/>
+              <wp:positionH relativeFrom="column">
+                <wp:posOffset>-599607</wp:posOffset>
+              </wp:positionH>
+              <wp:positionV relativeFrom="paragraph">
+                <wp:posOffset>-64031</wp:posOffset>
+              </wp:positionV>
+              <wp:extent cx="7809397" cy="0"/>
+              <wp:effectExtent l="0" t="0" r="13970" b="12700"/>
+              <wp:wrapNone/>
+              <wp:docPr id="2067918215" name="Connecteur droit 1"/>
+              <wp:cNvGraphicFramePr/>
+              <a:graphic xmlns:a="http://schemas.openxmlformats.org/drawingml/2006/main">
+                <a:graphicData uri="http://schemas.microsoft.com/office/word/2010/wordprocessingShape">
+                  <wps:wsp>
+                    <wps:cNvCnPr/>
+                    <wps:spPr>
+                      <a:xfrm>
+                        <a:off x="0" y="0"/>
+                        <a:ext cx="7809397" cy="0"/>
+                      </a:xfrm>
+                      <a:prstGeom prst="line">
+                        <a:avLst/>
+                      </a:prstGeom>
+                      <a:ln>
+                        <a:solidFill>
+                          <a:schemeClr val="tx1"/>
+                        </a:solidFill>
+                      </a:ln>
+                    </wps:spPr>
+                    <wps:style>
+                      <a:lnRef idx="1">
+                        <a:schemeClr val="accent1"/>
+                      </a:lnRef>
+                      <a:fillRef idx="0">
+                        <a:schemeClr val="accent1"/>
+                      </a:fillRef>
+                      <a:effectRef idx="0">
+                        <a:schemeClr val="accent1"/>
+                      </a:effectRef>
+                      <a:fontRef idx="minor">
+                        <a:schemeClr val="tx1"/>
+                      </a:fontRef>
+                    </wps:style>
+                    <wps:bodyPr/>
+                  </wps:wsp>
+                </a:graphicData>
+              </a:graphic>
+              <wp14:sizeRelH relativeFrom="margin">
+                <wp14:pctWidth>0</wp14:pctWidth>
+              </wp14:sizeRelH>
+            </wp:anchor>
+          </w:drawing>
+        </mc:Choice>
+        <mc:Fallback>
+          <w:pict>
+            <v:line w14:anchorId="5C81B331" id="Connecteur droit 1" o:spid="_x0000_s1026" style="position:absolute;z-index:251659264;visibility:visible;mso-wrap-style:square;mso-width-percent:0;mso-wrap-distance-left:9pt;mso-wrap-distance-top:0;mso-wrap-distance-right:9pt;mso-wrap-distance-bottom:0;mso-position-horizontal:absolute;mso-position-horizontal-relative:text;mso-position-vertical:absolute;mso-position-vertical-relative:text;mso-width-percent:0;mso-width-relative:margin" from="-47.2pt,-5.05pt" to="567.7pt,-5.05pt" o:gfxdata="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" strokecolor="black [3213]"/>
+          </w:pict>
+        </mc:Fallback>
+      </mc:AlternateContent>
+    </w:r>
+    <w:r>
+      <w:tab/>
+    </w:r>
+    <w:r>
+      <w:tab/>
+    </w:r>
+    <w:r>
+      <w:t>[</w:t>
+    </w:r>
+    <w:proofErr w:type="spellStart"/>
+    <w:proofErr w:type="gramStart"/>
+    <w:r>
+      <w:t>date</w:t>
+    </w:r>
+    <w:proofErr w:type="gramEnd"/>
+    <w:r>
+      <w:t>_impression</w:t>
+    </w:r>
+    <w:proofErr w:type="spellEnd"/>
+    <w:r>
+      <w:t>]</w:t>
+    </w:r>
+  </w:p>
+</w:ftr>
 </file>
 
 <file path=word/footnotes.xml><?xml version="1.0" encoding="utf-8"?>

</xml_diff>